<commit_message>
fix: unify MAG naming and legal company references
</commit_message>
<xml_diff>
--- a/docs/MAG_Homepage_Trilingual_Expanded_Final.docx
+++ b/docs/MAG_Homepage_Trilingual_Expanded_Final.docx
@@ -7,7 +7,7 @@
         <w:pStyle w:val="Heading1"/>
       </w:pPr>
       <w:r>
-        <w:t>MAG – Metal Advancement Group</w:t>
+        <w:t>Metall Advancement Group</w:t>
       </w:r>
     </w:p>
     <w:p>
@@ -184,7 +184,7 @@
         <w:pStyle w:val="Heading1"/>
       </w:pPr>
       <w:r>
-        <w:t>MAG – Metal Advancement Group</w:t>
+        <w:t>Metall Advancement Group</w:t>
       </w:r>
     </w:p>
     <w:p>
@@ -323,7 +323,7 @@
         <w:pStyle w:val="Heading1"/>
       </w:pPr>
       <w:r>
-        <w:t>MAG – Metal Advancement Group</w:t>
+        <w:t>Metall Advancement Group</w:t>
       </w:r>
     </w:p>
     <w:p>

</xml_diff>